<commit_message>
Update analyze script and final Exercise3 report
</commit_message>
<xml_diff>
--- a/doc/Exercise3_Report.docx
+++ b/doc/Exercise3_Report.docx
@@ -155,14 +155,14 @@
         <w:rPr>
           <w:rFonts w:ascii="Arial" w:hAnsi="Arial" w:cs="Arial"/>
         </w:rPr>
-        <w:t>The goal is to maximize fitness within a fixed budget of 10,000 fitness evaluations, using both single-objective and multi-objective population-based algorithms.</w:t>
-      </w:r>
-    </w:p>
-    <w:p>
-      <w:pPr>
-        <w:spacing w:line="360" w:lineRule="auto"/>
-        <w:rPr>
-          <w:rFonts w:ascii="Arial" w:hAnsi="Arial" w:cs="Arial"/>
+        <w:t>The goal is to maximize fitness within a fixed budget of 10,000 evaluations, by comparing single-objective and multi-objective population-based algorithms.</w:t>
+      </w:r>
+    </w:p>
+    <w:p>
+      <w:pPr>
+        <w:spacing w:line="360" w:lineRule="auto"/>
+        <w:rPr>
+          <w:rFonts w:ascii="Arial" w:hAnsi="Arial" w:cs="Arial" w:hint="eastAsia"/>
         </w:rPr>
       </w:pPr>
     </w:p>
@@ -199,57 +199,63 @@
         <w:rPr>
           <w:rFonts w:ascii="Arial" w:hAnsi="Arial" w:cs="Arial"/>
         </w:rPr>
-        <w:t>Single-Objective Algorithm (GSEMO)</w:t>
-      </w:r>
-    </w:p>
-    <w:p>
-      <w:pPr>
-        <w:spacing w:line="360" w:lineRule="auto"/>
-        <w:rPr>
-          <w:rFonts w:ascii="Arial" w:hAnsi="Arial" w:cs="Arial"/>
-        </w:rPr>
-      </w:pPr>
-      <w:r>
-        <w:rPr>
-          <w:rFonts w:ascii="Arial" w:hAnsi="Arial" w:cs="Arial"/>
-        </w:rPr>
-        <w:t>The single-objective approach is based on the Generalised Simple Evolutionary Multi-Objective Optimizer (GSEMO) framework, adapted to work as a population-based single-objective EA.</w:t>
-      </w:r>
-    </w:p>
-    <w:p>
-      <w:pPr>
-        <w:numPr>
-          <w:ilvl w:val="0"/>
-          <w:numId w:val="2"/>
-        </w:numPr>
-        <w:spacing w:line="360" w:lineRule="auto"/>
-        <w:rPr>
-          <w:rFonts w:ascii="Arial" w:hAnsi="Arial" w:cs="Arial"/>
-        </w:rPr>
-      </w:pPr>
-      <w:r>
-        <w:rPr>
-          <w:rFonts w:ascii="Arial" w:hAnsi="Arial" w:cs="Arial"/>
-        </w:rPr>
-        <w:t>Representation: Each solution is represented as a binary vector indicating selected elements.</w:t>
-      </w:r>
-    </w:p>
-    <w:p>
-      <w:pPr>
-        <w:numPr>
-          <w:ilvl w:val="0"/>
-          <w:numId w:val="2"/>
-        </w:numPr>
-        <w:spacing w:line="360" w:lineRule="auto"/>
-        <w:rPr>
-          <w:rFonts w:ascii="Arial" w:hAnsi="Arial" w:cs="Arial"/>
-        </w:rPr>
-      </w:pPr>
-      <w:r>
-        <w:rPr>
-          <w:rFonts w:ascii="Arial" w:hAnsi="Arial" w:cs="Arial"/>
-        </w:rPr>
-        <w:t xml:space="preserve">Fitness Function: For </w:t>
+        <w:t>In this exercise, we implemented three evolutionary algorithms: SOEA, MOEA, and GSEMO, based on the framework used in previous exercises.</w:t>
+      </w:r>
+    </w:p>
+    <w:p>
+      <w:pPr>
+        <w:spacing w:line="360" w:lineRule="auto"/>
+        <w:rPr>
+          <w:rFonts w:ascii="Arial" w:hAnsi="Arial" w:cs="Arial" w:hint="eastAsia"/>
+        </w:rPr>
+      </w:pPr>
+      <w:r>
+        <w:rPr>
+          <w:rFonts w:ascii="Arial" w:hAnsi="Arial" w:cs="Arial"/>
+        </w:rPr>
+        <w:t>All algorithms are population-based and use bit-string representation of candidate solutions. Fitness evaluation was done using the IOH framework with the same budget and population parameters.</w:t>
+      </w:r>
+    </w:p>
+    <w:p>
+      <w:pPr>
+        <w:spacing w:line="360" w:lineRule="auto"/>
+        <w:rPr>
+          <w:rFonts w:ascii="Arial" w:hAnsi="Arial" w:cs="Arial"/>
+        </w:rPr>
+      </w:pPr>
+      <w:r>
+        <w:rPr>
+          <w:rFonts w:ascii="Arial" w:hAnsi="Arial" w:cs="Arial"/>
+        </w:rPr>
+        <w:t>The SOEA applies uniform bit-flip mutation and fitness-based selection, focusing on optimizing a single objective.</w:t>
+      </w:r>
+    </w:p>
+    <w:p>
+      <w:pPr>
+        <w:spacing w:line="360" w:lineRule="auto"/>
+        <w:rPr>
+          <w:rFonts w:ascii="Arial" w:hAnsi="Arial" w:cs="Arial"/>
+        </w:rPr>
+      </w:pPr>
+      <w:r>
+        <w:rPr>
+          <w:rFonts w:ascii="Arial" w:hAnsi="Arial" w:cs="Arial"/>
+        </w:rPr>
+        <w:t>The MOEA extends this idea by maintaining a small Pareto set to balance fitness and constraint violation, encouraging diverse and stable solutions across objectives.</w:t>
+      </w:r>
+    </w:p>
+    <w:p>
+      <w:pPr>
+        <w:spacing w:line="360" w:lineRule="auto"/>
+        <w:rPr>
+          <w:rFonts w:ascii="Arial" w:hAnsi="Arial" w:cs="Arial"/>
+        </w:rPr>
+      </w:pPr>
+      <w:r>
+        <w:rPr>
+          <w:rFonts w:ascii="Arial" w:hAnsi="Arial" w:cs="Arial"/>
+        </w:rPr>
+        <w:t xml:space="preserve">Finally, the GSEMO is a mutation-only algorithm that stores non-dominated solutions to maintain diversity. It was tested on both </w:t>
       </w:r>
       <w:proofErr w:type="spellStart"/>
       <w:r>
@@ -277,130 +283,60 @@
         <w:rPr>
           <w:rFonts w:ascii="Arial" w:hAnsi="Arial" w:cs="Arial"/>
         </w:rPr>
-        <w:t>, the goal is to maximise fitness (coverage or influence value).</w:t>
-      </w:r>
-    </w:p>
-    <w:p>
-      <w:pPr>
-        <w:numPr>
-          <w:ilvl w:val="0"/>
-          <w:numId w:val="2"/>
-        </w:numPr>
-        <w:spacing w:line="360" w:lineRule="auto"/>
-        <w:rPr>
-          <w:rFonts w:ascii="Arial" w:hAnsi="Arial" w:cs="Arial"/>
-        </w:rPr>
-      </w:pPr>
-      <w:r>
-        <w:rPr>
-          <w:rFonts w:ascii="Arial" w:hAnsi="Arial" w:cs="Arial"/>
-        </w:rPr>
-        <w:t>Constraint Handling: Solutions exceeding the uniform constraint are penalised (negative or infeasible fitness values lead to removal or replacement).</w:t>
-      </w:r>
-    </w:p>
-    <w:p>
-      <w:pPr>
-        <w:numPr>
-          <w:ilvl w:val="0"/>
-          <w:numId w:val="2"/>
-        </w:numPr>
-        <w:spacing w:line="360" w:lineRule="auto"/>
-        <w:rPr>
-          <w:rFonts w:ascii="Arial" w:hAnsi="Arial" w:cs="Arial"/>
-        </w:rPr>
-      </w:pPr>
-      <w:r>
-        <w:rPr>
-          <w:rFonts w:ascii="Arial" w:hAnsi="Arial" w:cs="Arial"/>
-        </w:rPr>
-        <w:t>Variation Operators:</w:t>
-      </w:r>
-    </w:p>
-    <w:p>
-      <w:pPr>
-        <w:numPr>
-          <w:ilvl w:val="1"/>
-          <w:numId w:val="2"/>
-        </w:numPr>
-        <w:spacing w:line="360" w:lineRule="auto"/>
-        <w:rPr>
-          <w:rFonts w:ascii="Arial" w:hAnsi="Arial" w:cs="Arial"/>
-        </w:rPr>
-      </w:pPr>
-      <w:r>
-        <w:rPr>
-          <w:rFonts w:ascii="Arial" w:hAnsi="Arial" w:cs="Arial"/>
-        </w:rPr>
-        <w:t>Bit-flip mutation (each bit flips with probability 1/n).</w:t>
-      </w:r>
-    </w:p>
-    <w:p>
-      <w:pPr>
-        <w:numPr>
-          <w:ilvl w:val="1"/>
-          <w:numId w:val="2"/>
-        </w:numPr>
-        <w:spacing w:line="360" w:lineRule="auto"/>
-        <w:rPr>
-          <w:rFonts w:ascii="Arial" w:hAnsi="Arial" w:cs="Arial"/>
-        </w:rPr>
-      </w:pPr>
-      <w:r>
-        <w:rPr>
-          <w:rFonts w:ascii="Arial" w:hAnsi="Arial" w:cs="Arial"/>
-        </w:rPr>
-        <w:lastRenderedPageBreak/>
-        <w:t>Random reinitialization used to maintain diversity.</w:t>
-      </w:r>
-    </w:p>
-    <w:p>
-      <w:pPr>
-        <w:numPr>
-          <w:ilvl w:val="0"/>
-          <w:numId w:val="2"/>
-        </w:numPr>
-        <w:spacing w:line="360" w:lineRule="auto"/>
-        <w:rPr>
-          <w:rFonts w:ascii="Arial" w:hAnsi="Arial" w:cs="Arial"/>
-        </w:rPr>
-      </w:pPr>
-      <w:r>
-        <w:rPr>
-          <w:rFonts w:ascii="Arial" w:hAnsi="Arial" w:cs="Arial"/>
-        </w:rPr>
-        <w:t>Population Sizes Tested: 10, 20, and 50.</w:t>
-      </w:r>
-    </w:p>
-    <w:p>
-      <w:pPr>
-        <w:numPr>
-          <w:ilvl w:val="0"/>
-          <w:numId w:val="2"/>
-        </w:numPr>
-        <w:spacing w:line="360" w:lineRule="auto"/>
-        <w:rPr>
-          <w:rFonts w:ascii="Arial" w:hAnsi="Arial" w:cs="Arial"/>
-        </w:rPr>
-      </w:pPr>
-      <w:r>
-        <w:rPr>
-          <w:rFonts w:ascii="Arial" w:hAnsi="Arial" w:cs="Arial"/>
-        </w:rPr>
-        <w:t>Selection: Tournament or elitist selection to retain the best individuals.</w:t>
-      </w:r>
-    </w:p>
-    <w:p>
-      <w:pPr>
-        <w:spacing w:line="360" w:lineRule="auto"/>
-        <w:rPr>
-          <w:rFonts w:ascii="Arial" w:hAnsi="Arial" w:cs="Arial"/>
+        <w:t xml:space="preserve"> problems, demonstrating good robustness under different instance scales.</w:t>
+      </w:r>
+    </w:p>
+    <w:p>
+      <w:pPr>
+        <w:spacing w:line="360" w:lineRule="auto"/>
+        <w:rPr>
+          <w:rFonts w:ascii="Arial" w:hAnsi="Arial" w:cs="Arial"/>
+        </w:rPr>
+      </w:pPr>
+    </w:p>
+    <w:p>
+      <w:pPr>
+        <w:spacing w:line="360" w:lineRule="auto"/>
+        <w:rPr>
+          <w:rFonts w:ascii="Arial" w:hAnsi="Arial" w:cs="Arial"/>
+        </w:rPr>
+      </w:pPr>
+      <w:r>
+        <w:rPr>
+          <w:rFonts w:ascii="Arial" w:hAnsi="Arial" w:cs="Arial"/>
+        </w:rPr>
+        <w:t>All algorithms were implemented in Python (GA_Algorithms.py, uniform_ga_mut.py, and gsemo.py), and executed through run_ex3.py.</w:t>
+      </w:r>
+    </w:p>
+    <w:p>
+      <w:pPr>
+        <w:spacing w:line="360" w:lineRule="auto"/>
+        <w:rPr>
+          <w:rFonts w:ascii="Arial" w:hAnsi="Arial" w:cs="Arial"/>
+        </w:rPr>
+      </w:pPr>
+      <w:r>
+        <w:rPr>
+          <w:rFonts w:ascii="Arial" w:hAnsi="Arial" w:cs="Arial"/>
+        </w:rPr>
+        <w:t>The analysis and visualization of results were done in analyze_ex3.py, which produced the three figures shown in this report.</w:t>
+      </w:r>
+    </w:p>
+    <w:p>
+      <w:pPr>
+        <w:spacing w:line="360" w:lineRule="auto"/>
+        <w:rPr>
+          <w:rFonts w:ascii="Arial" w:hAnsi="Arial" w:cs="Arial" w:hint="eastAsia"/>
           <w:b/>
           <w:bCs/>
           <w:sz w:val="28"/>
           <w:szCs w:val="28"/>
         </w:rPr>
       </w:pPr>
-      <w:r>
+    </w:p>
+    <w:p>
+      <w:pPr>
+        <w:spacing w:line="360" w:lineRule="auto"/>
         <w:rPr>
           <w:rFonts w:ascii="Arial" w:hAnsi="Arial" w:cs="Arial"/>
           <w:b/>
@@ -408,6 +344,15 @@
           <w:sz w:val="28"/>
           <w:szCs w:val="28"/>
         </w:rPr>
+      </w:pPr>
+      <w:r>
+        <w:rPr>
+          <w:rFonts w:ascii="Arial" w:hAnsi="Arial" w:cs="Arial"/>
+          <w:b/>
+          <w:bCs/>
+          <w:sz w:val="28"/>
+          <w:szCs w:val="28"/>
+        </w:rPr>
         <w:t>Multi-Objective Algorithm (MOEA and SOEA)</w:t>
       </w:r>
     </w:p>
@@ -427,79 +372,53 @@
     </w:p>
     <w:p>
       <w:pPr>
-        <w:numPr>
-          <w:ilvl w:val="0"/>
-          <w:numId w:val="3"/>
-        </w:numPr>
-        <w:spacing w:line="360" w:lineRule="auto"/>
-        <w:rPr>
-          <w:rFonts w:ascii="Arial" w:hAnsi="Arial" w:cs="Arial"/>
-        </w:rPr>
-      </w:pPr>
-      <w:r>
-        <w:rPr>
-          <w:rFonts w:ascii="Arial" w:hAnsi="Arial" w:cs="Arial"/>
-        </w:rPr>
-        <w:t>MOEA: Multi-objective EA maintaining a Pareto front between fitness and constraint violation.</w:t>
-      </w:r>
-    </w:p>
-    <w:p>
-      <w:pPr>
-        <w:numPr>
-          <w:ilvl w:val="0"/>
-          <w:numId w:val="3"/>
-        </w:numPr>
-        <w:spacing w:line="360" w:lineRule="auto"/>
-        <w:rPr>
-          <w:rFonts w:ascii="Arial" w:hAnsi="Arial" w:cs="Arial"/>
-        </w:rPr>
-      </w:pPr>
-      <w:r>
-        <w:rPr>
-          <w:rFonts w:ascii="Arial" w:hAnsi="Arial" w:cs="Arial"/>
-        </w:rPr>
-        <w:t>SOEA: Simplified version balancing exploration (mutation) and exploitation (selection).</w:t>
-      </w:r>
-    </w:p>
-    <w:p>
-      <w:pPr>
-        <w:numPr>
-          <w:ilvl w:val="0"/>
-          <w:numId w:val="3"/>
-        </w:numPr>
-        <w:spacing w:line="360" w:lineRule="auto"/>
-        <w:rPr>
-          <w:rFonts w:ascii="Arial" w:hAnsi="Arial" w:cs="Arial"/>
-        </w:rPr>
-      </w:pPr>
-      <w:r>
-        <w:rPr>
-          <w:rFonts w:ascii="Arial" w:hAnsi="Arial" w:cs="Arial"/>
-        </w:rPr>
-        <w:t>Population Diversity: Maintained by random mutation and domination-based sorting.</w:t>
-      </w:r>
-    </w:p>
-    <w:p>
-      <w:pPr>
-        <w:numPr>
-          <w:ilvl w:val="0"/>
-          <w:numId w:val="3"/>
-        </w:numPr>
-        <w:spacing w:line="360" w:lineRule="auto"/>
-        <w:rPr>
-          <w:rFonts w:ascii="Arial" w:hAnsi="Arial" w:cs="Arial"/>
-        </w:rPr>
-      </w:pPr>
-      <w:r>
-        <w:rPr>
-          <w:rFonts w:ascii="Arial" w:hAnsi="Arial" w:cs="Arial"/>
-        </w:rPr>
-        <w:t>Population Sizes Tested: 10, 20, and 50 (same as GSEMO).</w:t>
-      </w:r>
-    </w:p>
-    <w:p>
-      <w:pPr>
-        <w:spacing w:line="360" w:lineRule="auto"/>
+        <w:spacing w:line="360" w:lineRule="auto"/>
+        <w:ind w:firstLine="720"/>
+        <w:rPr>
+          <w:rFonts w:ascii="Arial" w:hAnsi="Arial" w:cs="Arial"/>
+        </w:rPr>
+      </w:pPr>
+      <w:r>
+        <w:rPr>
+          <w:rFonts w:ascii="Arial" w:hAnsi="Arial" w:cs="Arial"/>
+        </w:rPr>
+        <w:t>• MOEA: Maintains a Pareto front between fitness and constraint violation.</w:t>
+      </w:r>
+    </w:p>
+    <w:p>
+      <w:pPr>
+        <w:spacing w:line="360" w:lineRule="auto"/>
+        <w:ind w:firstLine="720"/>
+        <w:rPr>
+          <w:rFonts w:ascii="Arial" w:hAnsi="Arial" w:cs="Arial"/>
+        </w:rPr>
+      </w:pPr>
+      <w:r>
+        <w:rPr>
+          <w:rFonts w:ascii="Arial" w:hAnsi="Arial" w:cs="Arial"/>
+        </w:rPr>
+        <w:t>• SOEA: Simplified version focusing on fitness-based selection.</w:t>
+      </w:r>
+    </w:p>
+    <w:p>
+      <w:pPr>
+        <w:spacing w:line="360" w:lineRule="auto"/>
+        <w:ind w:left="720"/>
+        <w:rPr>
+          <w:rFonts w:ascii="Arial" w:hAnsi="Arial" w:cs="Arial"/>
+        </w:rPr>
+      </w:pPr>
+      <w:r>
+        <w:rPr>
+          <w:rFonts w:ascii="Arial" w:hAnsi="Arial" w:cs="Arial"/>
+        </w:rPr>
+        <w:t>• Population diversity: Preserved by random mutation and domination-based sorting.</w:t>
+      </w:r>
+    </w:p>
+    <w:p>
+      <w:pPr>
+        <w:spacing w:line="360" w:lineRule="auto"/>
+        <w:ind w:firstLine="720"/>
         <w:rPr>
           <w:rFonts w:ascii="Arial" w:hAnsi="Arial" w:cs="Arial"/>
           <w:b/>
@@ -508,6 +427,12 @@
           <w:szCs w:val="32"/>
         </w:rPr>
       </w:pPr>
+      <w:r>
+        <w:rPr>
+          <w:rFonts w:ascii="Arial" w:hAnsi="Arial" w:cs="Arial"/>
+        </w:rPr>
+        <w:t>• Population sizes tested: 10, 20, and 50 (same as GSEMO).</w:t>
+      </w:r>
     </w:p>
     <w:p>
       <w:pPr>
@@ -641,7 +566,7 @@
       <w:pPr>
         <w:spacing w:line="360" w:lineRule="auto"/>
         <w:rPr>
-          <w:rFonts w:ascii="Arial" w:hAnsi="Arial" w:cs="Arial"/>
+          <w:rFonts w:ascii="Arial" w:hAnsi="Arial" w:cs="Arial" w:hint="eastAsia"/>
         </w:rPr>
       </w:pPr>
       <w:r>
@@ -662,70 +587,6 @@
         </w:rPr>
         <w:t>Results were averaged and plotted to observe convergence and performance differences.</w:t>
       </w:r>
-    </w:p>
-    <w:p>
-      <w:pPr>
-        <w:spacing w:line="360" w:lineRule="auto"/>
-        <w:rPr>
-          <w:rFonts w:ascii="Arial" w:hAnsi="Arial" w:cs="Arial"/>
-        </w:rPr>
-      </w:pPr>
-    </w:p>
-    <w:p>
-      <w:pPr>
-        <w:spacing w:line="360" w:lineRule="auto"/>
-        <w:rPr>
-          <w:rFonts w:ascii="Arial" w:hAnsi="Arial" w:cs="Arial"/>
-        </w:rPr>
-      </w:pPr>
-    </w:p>
-    <w:p>
-      <w:pPr>
-        <w:spacing w:line="360" w:lineRule="auto"/>
-        <w:rPr>
-          <w:rFonts w:ascii="Arial" w:hAnsi="Arial" w:cs="Arial"/>
-        </w:rPr>
-      </w:pPr>
-    </w:p>
-    <w:p>
-      <w:pPr>
-        <w:spacing w:line="360" w:lineRule="auto"/>
-        <w:rPr>
-          <w:rFonts w:ascii="Arial" w:hAnsi="Arial" w:cs="Arial"/>
-        </w:rPr>
-      </w:pPr>
-    </w:p>
-    <w:p>
-      <w:pPr>
-        <w:spacing w:line="360" w:lineRule="auto"/>
-        <w:rPr>
-          <w:rFonts w:ascii="Arial" w:hAnsi="Arial" w:cs="Arial"/>
-        </w:rPr>
-      </w:pPr>
-    </w:p>
-    <w:p>
-      <w:pPr>
-        <w:spacing w:line="360" w:lineRule="auto"/>
-        <w:rPr>
-          <w:rFonts w:ascii="Arial" w:hAnsi="Arial" w:cs="Arial"/>
-        </w:rPr>
-      </w:pPr>
-    </w:p>
-    <w:p>
-      <w:pPr>
-        <w:spacing w:line="360" w:lineRule="auto"/>
-        <w:rPr>
-          <w:rFonts w:ascii="Arial" w:hAnsi="Arial" w:cs="Arial"/>
-        </w:rPr>
-      </w:pPr>
-    </w:p>
-    <w:p>
-      <w:pPr>
-        <w:spacing w:line="360" w:lineRule="auto"/>
-        <w:rPr>
-          <w:rFonts w:ascii="Arial" w:hAnsi="Arial" w:cs="Arial"/>
-        </w:rPr>
-      </w:pPr>
     </w:p>
     <w:p>
       <w:pPr>
@@ -982,130 +843,82 @@
         <w:rPr>
           <w:rFonts w:ascii="Arial" w:hAnsi="Arial" w:cs="Arial"/>
         </w:rPr>
+        <w:t>Larger populations (50) explore more broadly and achieve slightly better final fitness.</w:t>
+      </w:r>
+    </w:p>
+    <w:p>
+      <w:pPr>
+        <w:spacing w:line="360" w:lineRule="auto"/>
+        <w:rPr>
+          <w:rFonts w:ascii="Arial" w:hAnsi="Arial" w:cs="Arial"/>
+        </w:rPr>
+      </w:pPr>
+    </w:p>
+    <w:p>
+      <w:pPr>
+        <w:spacing w:line="360" w:lineRule="auto"/>
+        <w:rPr>
+          <w:rFonts w:ascii="Arial" w:hAnsi="Arial" w:cs="Arial"/>
+        </w:rPr>
+      </w:pPr>
+    </w:p>
+    <w:p>
+      <w:pPr>
+        <w:spacing w:line="360" w:lineRule="auto"/>
+        <w:rPr>
+          <w:rFonts w:ascii="Arial" w:hAnsi="Arial" w:cs="Arial"/>
+        </w:rPr>
+      </w:pPr>
+    </w:p>
+    <w:p>
+      <w:pPr>
+        <w:spacing w:line="360" w:lineRule="auto"/>
+        <w:rPr>
+          <w:rFonts w:ascii="Arial" w:hAnsi="Arial" w:cs="Arial"/>
+        </w:rPr>
+      </w:pPr>
+    </w:p>
+    <w:p>
+      <w:pPr>
+        <w:spacing w:line="360" w:lineRule="auto"/>
+        <w:rPr>
+          <w:rFonts w:ascii="Arial" w:hAnsi="Arial" w:cs="Arial"/>
+        </w:rPr>
+      </w:pPr>
+    </w:p>
+    <w:p>
+      <w:pPr>
+        <w:spacing w:line="360" w:lineRule="auto"/>
+        <w:rPr>
+          <w:rFonts w:ascii="Arial" w:hAnsi="Arial" w:cs="Arial" w:hint="eastAsia"/>
+        </w:rPr>
+      </w:pPr>
+    </w:p>
+    <w:p>
+      <w:pPr>
+        <w:spacing w:line="360" w:lineRule="auto"/>
+        <w:rPr>
+          <w:rFonts w:ascii="Arial" w:hAnsi="Arial" w:cs="Arial"/>
+        </w:rPr>
+      </w:pPr>
+    </w:p>
+    <w:p>
+      <w:pPr>
+        <w:spacing w:line="360" w:lineRule="auto"/>
+        <w:ind w:firstLine="720"/>
+        <w:rPr>
+          <w:rFonts w:ascii="Arial" w:hAnsi="Arial" w:cs="Arial"/>
+          <w:b/>
+          <w:bCs/>
+        </w:rPr>
+      </w:pPr>
+      <w:r>
+        <w:rPr>
+          <w:rFonts w:ascii="Arial" w:hAnsi="Arial" w:cs="Arial"/>
+          <w:b/>
+          <w:bCs/>
+        </w:rPr>
         <w:lastRenderedPageBreak/>
-        <w:t>Larger populations (50) explore more broadly and achieve slightly better final fitness.</w:t>
-      </w:r>
-    </w:p>
-    <w:p>
-      <w:pPr>
-        <w:spacing w:line="360" w:lineRule="auto"/>
-        <w:rPr>
-          <w:rFonts w:ascii="Arial" w:hAnsi="Arial" w:cs="Arial"/>
-        </w:rPr>
-      </w:pPr>
-    </w:p>
-    <w:p>
-      <w:pPr>
-        <w:spacing w:line="360" w:lineRule="auto"/>
-        <w:rPr>
-          <w:rFonts w:ascii="Arial" w:hAnsi="Arial" w:cs="Arial"/>
-        </w:rPr>
-      </w:pPr>
-    </w:p>
-    <w:p>
-      <w:pPr>
-        <w:spacing w:line="360" w:lineRule="auto"/>
-        <w:rPr>
-          <w:rFonts w:ascii="Arial" w:hAnsi="Arial" w:cs="Arial"/>
-        </w:rPr>
-      </w:pPr>
-    </w:p>
-    <w:p>
-      <w:pPr>
-        <w:spacing w:line="360" w:lineRule="auto"/>
-        <w:rPr>
-          <w:rFonts w:ascii="Arial" w:hAnsi="Arial" w:cs="Arial"/>
-        </w:rPr>
-      </w:pPr>
-    </w:p>
-    <w:p>
-      <w:pPr>
-        <w:spacing w:line="360" w:lineRule="auto"/>
-        <w:rPr>
-          <w:rFonts w:ascii="Arial" w:hAnsi="Arial" w:cs="Arial"/>
-        </w:rPr>
-      </w:pPr>
-    </w:p>
-    <w:p>
-      <w:pPr>
-        <w:spacing w:line="360" w:lineRule="auto"/>
-        <w:rPr>
-          <w:rFonts w:ascii="Arial" w:hAnsi="Arial" w:cs="Arial"/>
-        </w:rPr>
-      </w:pPr>
-    </w:p>
-    <w:p>
-      <w:pPr>
-        <w:spacing w:line="360" w:lineRule="auto"/>
-        <w:rPr>
-          <w:rFonts w:ascii="Arial" w:hAnsi="Arial" w:cs="Arial"/>
-        </w:rPr>
-      </w:pPr>
-    </w:p>
-    <w:p>
-      <w:pPr>
-        <w:spacing w:line="360" w:lineRule="auto"/>
-        <w:rPr>
-          <w:rFonts w:ascii="Arial" w:hAnsi="Arial" w:cs="Arial"/>
-        </w:rPr>
-      </w:pPr>
-    </w:p>
-    <w:p>
-      <w:pPr>
-        <w:spacing w:line="360" w:lineRule="auto"/>
-        <w:rPr>
-          <w:rFonts w:ascii="Arial" w:hAnsi="Arial" w:cs="Arial"/>
-        </w:rPr>
-      </w:pPr>
-    </w:p>
-    <w:p>
-      <w:pPr>
-        <w:spacing w:line="360" w:lineRule="auto"/>
-        <w:rPr>
-          <w:rFonts w:ascii="Arial" w:hAnsi="Arial" w:cs="Arial"/>
-        </w:rPr>
-      </w:pPr>
-    </w:p>
-    <w:p>
-      <w:pPr>
-        <w:spacing w:line="360" w:lineRule="auto"/>
-        <w:rPr>
-          <w:rFonts w:ascii="Arial" w:hAnsi="Arial" w:cs="Arial"/>
-        </w:rPr>
-      </w:pPr>
-    </w:p>
-    <w:p>
-      <w:pPr>
-        <w:spacing w:line="360" w:lineRule="auto"/>
-        <w:rPr>
-          <w:rFonts w:ascii="Arial" w:hAnsi="Arial" w:cs="Arial"/>
-        </w:rPr>
-      </w:pPr>
-    </w:p>
-    <w:p>
-      <w:pPr>
-        <w:spacing w:line="360" w:lineRule="auto"/>
-        <w:rPr>
-          <w:rFonts w:ascii="Arial" w:hAnsi="Arial" w:cs="Arial"/>
-        </w:rPr>
-      </w:pPr>
-    </w:p>
-    <w:p>
-      <w:pPr>
-        <w:spacing w:line="360" w:lineRule="auto"/>
-        <w:ind w:firstLine="720"/>
-        <w:rPr>
-          <w:rFonts w:ascii="Arial" w:hAnsi="Arial" w:cs="Arial"/>
-          <w:b/>
-          <w:bCs/>
-        </w:rPr>
-      </w:pPr>
-      <w:r>
-        <w:rPr>
-          <w:rFonts w:ascii="Arial" w:hAnsi="Arial" w:cs="Arial"/>
-          <w:b/>
-          <w:bCs/>
-        </w:rPr>
         <w:t>Fig2: Comparison of Algorithms (GSEMO, MOEA, SOEA)</w:t>
       </w:r>
     </w:p>
@@ -1139,7 +952,6 @@
           <w:sz w:val="28"/>
           <w:szCs w:val="28"/>
         </w:rPr>
-        <w:lastRenderedPageBreak/>
         <w:drawing>
           <wp:inline distT="0" distB="0" distL="0" distR="0" wp14:anchorId="7ABEAA40" wp14:editId="0B455CC7">
             <wp:extent cx="4529667" cy="2830916"/>
@@ -1318,55 +1130,23 @@
       <w:pPr>
         <w:spacing w:line="360" w:lineRule="auto"/>
         <w:rPr>
-          <w:rFonts w:ascii="Arial" w:hAnsi="Arial" w:cs="Arial"/>
-        </w:rPr>
-      </w:pPr>
-    </w:p>
-    <w:p>
-      <w:pPr>
-        <w:spacing w:line="360" w:lineRule="auto"/>
-        <w:rPr>
-          <w:rFonts w:ascii="Arial" w:hAnsi="Arial" w:cs="Arial"/>
-        </w:rPr>
-      </w:pPr>
-    </w:p>
-    <w:p>
-      <w:pPr>
-        <w:spacing w:line="360" w:lineRule="auto"/>
-        <w:rPr>
-          <w:rFonts w:ascii="Arial" w:hAnsi="Arial" w:cs="Arial"/>
-        </w:rPr>
-      </w:pPr>
-    </w:p>
-    <w:p>
-      <w:pPr>
-        <w:spacing w:line="360" w:lineRule="auto"/>
-        <w:rPr>
-          <w:rFonts w:ascii="Arial" w:hAnsi="Arial" w:cs="Arial"/>
-        </w:rPr>
-      </w:pPr>
-    </w:p>
-    <w:p>
-      <w:pPr>
-        <w:spacing w:line="360" w:lineRule="auto"/>
-        <w:rPr>
-          <w:rFonts w:ascii="Arial" w:hAnsi="Arial" w:cs="Arial"/>
-        </w:rPr>
-      </w:pPr>
-    </w:p>
-    <w:p>
-      <w:pPr>
-        <w:spacing w:line="360" w:lineRule="auto"/>
-        <w:rPr>
-          <w:rFonts w:ascii="Arial" w:hAnsi="Arial" w:cs="Arial"/>
-        </w:rPr>
-      </w:pPr>
-    </w:p>
-    <w:p>
-      <w:pPr>
-        <w:spacing w:line="360" w:lineRule="auto"/>
-        <w:rPr>
-          <w:rFonts w:ascii="Arial" w:hAnsi="Arial" w:cs="Arial"/>
+          <w:rFonts w:ascii="Arial" w:hAnsi="Arial" w:cs="Arial" w:hint="eastAsia"/>
+        </w:rPr>
+      </w:pPr>
+    </w:p>
+    <w:p>
+      <w:pPr>
+        <w:spacing w:line="360" w:lineRule="auto"/>
+        <w:rPr>
+          <w:rFonts w:ascii="Arial" w:hAnsi="Arial" w:cs="Arial"/>
+        </w:rPr>
+      </w:pPr>
+    </w:p>
+    <w:p>
+      <w:pPr>
+        <w:spacing w:line="360" w:lineRule="auto"/>
+        <w:rPr>
+          <w:rFonts w:ascii="Arial" w:hAnsi="Arial" w:cs="Arial" w:hint="eastAsia"/>
         </w:rPr>
       </w:pPr>
     </w:p>
@@ -1394,6 +1174,7 @@
           <w:b/>
           <w:bCs/>
         </w:rPr>
+        <w:lastRenderedPageBreak/>
         <w:t>Fig</w:t>
       </w:r>
       <w:r>
@@ -1471,19 +1252,8 @@
     <w:p>
       <w:pPr>
         <w:spacing w:line="360" w:lineRule="auto"/>
-        <w:ind w:firstLine="720"/>
-        <w:rPr>
-          <w:rFonts w:ascii="Arial" w:hAnsi="Arial" w:cs="Arial"/>
-          <w:b/>
-          <w:bCs/>
-        </w:rPr>
-      </w:pPr>
-    </w:p>
-    <w:p>
-      <w:pPr>
-        <w:spacing w:line="360" w:lineRule="auto"/>
-        <w:rPr>
-          <w:rFonts w:ascii="Arial" w:hAnsi="Arial" w:cs="Arial"/>
+        <w:rPr>
+          <w:rFonts w:ascii="Arial" w:hAnsi="Arial" w:cs="Arial" w:hint="eastAsia"/>
         </w:rPr>
       </w:pPr>
     </w:p>
@@ -1550,7 +1320,7 @@
     <w:p>
       <w:pPr>
         <w:spacing w:line="360" w:lineRule="auto"/>
-        <w:ind w:firstLine="720"/>
+        <w:ind w:left="720"/>
         <w:rPr>
           <w:rFonts w:ascii="Arial" w:hAnsi="Arial" w:cs="Arial"/>
           <w:b/>
@@ -1675,6 +1445,30 @@
     <w:p>
       <w:pPr>
         <w:spacing w:line="360" w:lineRule="auto"/>
+        <w:rPr>
+          <w:rFonts w:ascii="Arial" w:hAnsi="Arial" w:cs="Arial"/>
+        </w:rPr>
+      </w:pPr>
+    </w:p>
+    <w:p>
+      <w:pPr>
+        <w:spacing w:line="360" w:lineRule="auto"/>
+        <w:rPr>
+          <w:rFonts w:ascii="Arial" w:hAnsi="Arial" w:cs="Arial"/>
+        </w:rPr>
+      </w:pPr>
+    </w:p>
+    <w:p>
+      <w:pPr>
+        <w:spacing w:line="360" w:lineRule="auto"/>
+        <w:rPr>
+          <w:rFonts w:ascii="Arial" w:hAnsi="Arial" w:cs="Arial" w:hint="eastAsia"/>
+        </w:rPr>
+      </w:pPr>
+    </w:p>
+    <w:p>
+      <w:pPr>
+        <w:spacing w:line="360" w:lineRule="auto"/>
         <w:ind w:firstLine="720"/>
         <w:rPr>
           <w:rFonts w:ascii="Arial" w:hAnsi="Arial" w:cs="Arial"/>
@@ -1709,7 +1503,7 @@
       <w:pPr>
         <w:spacing w:line="360" w:lineRule="auto"/>
         <w:rPr>
-          <w:rFonts w:ascii="Arial" w:hAnsi="Arial" w:cs="Arial"/>
+          <w:rFonts w:ascii="Arial" w:hAnsi="Arial" w:cs="Arial" w:hint="eastAsia"/>
           <w:b/>
           <w:bCs/>
           <w:sz w:val="28"/>
@@ -1727,18 +1521,6 @@
         <w:lastRenderedPageBreak/>
         <w:t>Analysis</w:t>
       </w:r>
-    </w:p>
-    <w:p>
-      <w:pPr>
-        <w:spacing w:line="360" w:lineRule="auto"/>
-        <w:rPr>
-          <w:rFonts w:ascii="Arial" w:hAnsi="Arial" w:cs="Arial"/>
-          <w:b/>
-          <w:bCs/>
-          <w:sz w:val="28"/>
-          <w:szCs w:val="28"/>
-        </w:rPr>
-      </w:pPr>
     </w:p>
     <w:p>
       <w:pPr>
@@ -1889,15 +1671,15 @@
       <w:pPr>
         <w:spacing w:line="360" w:lineRule="auto"/>
         <w:rPr>
-          <w:rFonts w:ascii="Arial" w:hAnsi="Arial" w:cs="Arial" w:hint="eastAsia"/>
-        </w:rPr>
-      </w:pPr>
-    </w:p>
-    <w:p>
-      <w:pPr>
-        <w:spacing w:line="360" w:lineRule="auto"/>
-        <w:rPr>
-          <w:rFonts w:ascii="Arial" w:hAnsi="Arial" w:cs="Arial" w:hint="eastAsia"/>
+          <w:rFonts w:ascii="Arial" w:hAnsi="Arial" w:cs="Arial"/>
+        </w:rPr>
+      </w:pPr>
+    </w:p>
+    <w:p>
+      <w:pPr>
+        <w:spacing w:line="360" w:lineRule="auto"/>
+        <w:rPr>
+          <w:rFonts w:ascii="Arial" w:hAnsi="Arial" w:cs="Arial"/>
           <w:b/>
           <w:bCs/>
           <w:sz w:val="28"/>
@@ -1940,19 +1722,7 @@
         <w:rPr>
           <w:rFonts w:ascii="Arial" w:hAnsi="Arial" w:cs="Arial"/>
         </w:rPr>
-        <w:t xml:space="preserve">The results show that increasing the population size improves diversity and </w:t>
-      </w:r>
-      <w:r>
-        <w:rPr>
-          <w:rFonts w:ascii="Arial" w:hAnsi="Arial" w:cs="Arial"/>
-        </w:rPr>
-        <w:t>stability but</w:t>
-      </w:r>
-      <w:r>
-        <w:rPr>
-          <w:rFonts w:ascii="Arial" w:hAnsi="Arial" w:cs="Arial"/>
-        </w:rPr>
-        <w:t xml:space="preserve"> slows down convergence at the beginning.</w:t>
+        <w:t>The results show that increasing the population size improves diversity and stability but slows down convergence at the beginning.</w:t>
       </w:r>
     </w:p>
     <w:p>
@@ -1973,7 +1743,7 @@
       <w:pPr>
         <w:spacing w:line="360" w:lineRule="auto"/>
         <w:rPr>
-          <w:rFonts w:ascii="Arial" w:hAnsi="Arial" w:cs="Arial" w:hint="eastAsia"/>
+          <w:rFonts w:ascii="Arial" w:hAnsi="Arial" w:cs="Arial"/>
         </w:rPr>
       </w:pPr>
       <w:r>
@@ -2014,6 +1784,7 @@
           <w:sz w:val="28"/>
           <w:szCs w:val="28"/>
         </w:rPr>
+        <w:lastRenderedPageBreak/>
         <w:t>U</w:t>
       </w:r>
       <w:r>
@@ -2031,7 +1802,7 @@
       <w:pPr>
         <w:spacing w:line="360" w:lineRule="auto"/>
         <w:rPr>
-          <w:rFonts w:ascii="Arial" w:hAnsi="Arial" w:cs="Arial"/>
+          <w:rFonts w:ascii="Arial" w:hAnsi="Arial" w:cs="Arial" w:hint="eastAsia"/>
           <w:b/>
           <w:bCs/>
           <w:sz w:val="28"/>
@@ -2050,60 +1821,8 @@
         <w:rPr>
           <w:rFonts w:ascii="Arial" w:hAnsi="Arial" w:cs="Arial"/>
         </w:rPr>
-        <w:t>Generative AI (ChatGPT) is used for</w:t>
-      </w:r>
-    </w:p>
-    <w:p>
-      <w:pPr>
-        <w:spacing w:line="360" w:lineRule="auto"/>
-        <w:rPr>
-          <w:rFonts w:ascii="Arial" w:hAnsi="Arial" w:cs="Arial"/>
-        </w:rPr>
-      </w:pPr>
-    </w:p>
-    <w:p>
-      <w:pPr>
-        <w:spacing w:line="360" w:lineRule="auto"/>
-        <w:rPr>
-          <w:rFonts w:ascii="Arial" w:hAnsi="Arial" w:cs="Arial"/>
-        </w:rPr>
-      </w:pPr>
-      <w:r>
-        <w:rPr>
-          <w:rFonts w:ascii="Arial" w:hAnsi="Arial" w:cs="Arial"/>
-        </w:rPr>
-        <w:t>Help design algorithm structures and explain theoretical aspects.</w:t>
-      </w:r>
-    </w:p>
-    <w:p>
-      <w:pPr>
-        <w:spacing w:line="360" w:lineRule="auto"/>
-        <w:rPr>
-          <w:rFonts w:ascii="Arial" w:hAnsi="Arial" w:cs="Arial"/>
-        </w:rPr>
-      </w:pPr>
-    </w:p>
-    <w:p>
-      <w:pPr>
-        <w:spacing w:line="360" w:lineRule="auto"/>
-        <w:rPr>
-          <w:rFonts w:ascii="Arial" w:hAnsi="Arial" w:cs="Arial"/>
-        </w:rPr>
-      </w:pPr>
-      <w:r>
-        <w:rPr>
-          <w:rFonts w:ascii="Arial" w:hAnsi="Arial" w:cs="Arial"/>
-        </w:rPr>
-        <w:t>Assist in writing drawing scripts.</w:t>
-      </w:r>
-    </w:p>
-    <w:p>
-      <w:pPr>
-        <w:spacing w:line="360" w:lineRule="auto"/>
-        <w:rPr>
-          <w:rFonts w:ascii="Arial" w:hAnsi="Arial" w:cs="Arial"/>
-        </w:rPr>
-      </w:pPr>
+        <w:t>Generative AI (ChatGPT) was used to help design algorithm structures, explain theoretical aspects, and assist in writing plotting scripts.</w:t>
+      </w:r>
     </w:p>
     <w:p>
       <w:pPr>

</xml_diff>